<commit_message>
docs: update team structure and project context to Data Science
</commit_message>
<xml_diff>
--- a/MalFunc_Project_Documentation.docx
+++ b/MalFunc_Project_Documentation.docx
@@ -26,7 +26,7 @@
         <w:t xml:space="preserve"> </w:t>
       </w:r>
       <w:r>
-        <w:t xml:space="preserve">Computer Programming</w:t>
+        <w:t xml:space="preserve">University Data Science Project</w:t>
       </w:r>
       <w:r>
         <w:br/>
@@ -36,13 +36,13 @@
           <w:b/>
           <w:bCs/>
         </w:rPr>
-        <w:t xml:space="preserve">Project Leader:</w:t>
-      </w:r>
-      <w:r>
-        <w:t xml:space="preserve"> </w:t>
-      </w:r>
-      <w:r>
-        <w:t xml:space="preserve">Faizan Toheed</w:t>
+        <w:t xml:space="preserve">Team Members:</w:t>
+      </w:r>
+      <w:r>
+        <w:t xml:space="preserve"> </w:t>
+      </w:r>
+      <w:r>
+        <w:t xml:space="preserve">Faizan Toheed, Muhammad Usman, Shah Faisal Ilyas, Muhammad Rohan Jabbar</w:t>
       </w:r>
     </w:p>
     <w:p>

</xml_diff>

<commit_message>
docs: align all documentation (including docx) for vectorize_mul
</commit_message>
<xml_diff>
--- a/MalFunc_Project_Documentation.docx
+++ b/MalFunc_Project_Documentation.docx
@@ -1097,7 +1097,7 @@
         <w:pStyle w:val="Heading2"/>
       </w:pPr>
       <w:r>
-        <w:t xml:space="preserve">5. vectorize_mul(data)</w:t>
+        <w:t>5. vectorize_mul(a, b)</w:t>
       </w:r>
     </w:p>
     <w:p>
@@ -1154,17 +1154,7 @@
         </w:numPr>
       </w:pPr>
       <w:r>
-        <w:rPr>
-          <w:b/>
-          <w:bCs/>
-        </w:rPr>
-        <w:t xml:space="preserve">Input:</w:t>
-      </w:r>
-      <w:r>
-        <w:t xml:space="preserve"> </w:t>
-      </w:r>
-      <w:r>
-        <w:t xml:space="preserve">Takes a list and a multiplier.</w:t>
+        <w:t>Takes two lists of equal length.</w:t>
       </w:r>
     </w:p>
     <w:p>
@@ -1176,17 +1166,7 @@
         </w:numPr>
       </w:pPr>
       <w:r>
-        <w:rPr>
-          <w:b/>
-          <w:bCs/>
-        </w:rPr>
-        <w:t xml:space="preserve">Map:</w:t>
-      </w:r>
-      <w:r>
-        <w:t xml:space="preserve"> </w:t>
-      </w:r>
-      <w:r>
-        <w:t xml:space="preserve">Iterate through the list and multiply every numeric element by the scalar.</w:t>
+        <w:t>Perform element-wise multiplication (recursively if nested) and return the resulting list.</w:t>
       </w:r>
     </w:p>
     <w:p>

</xml_diff>